<commit_message>
A2 form except the section 5
</commit_message>
<xml_diff>
--- a/forms/A2_form.docx
+++ b/forms/A2_form.docx
@@ -135,7 +135,7 @@
               <w:spacing w:after="80"/>
             </w:pPr>
             <w:r>
-              <w:t xml:space="preserve"/>
+              <w:t>[LEFT FOR TEAM] the project name used in A1 (if any, beyond team id G04)</w:t>
             </w:r>
           </w:p>
         </w:tc>
@@ -581,7 +581,7 @@
               <w:spacing w:after="80"/>
             </w:pPr>
             <w:r>
-              <w:t xml:space="preserve"/>
+              <w:t>Domain: Education. Data speciality: Bangla Mathematics. Primary NFR + target: Calibration — Expected Calibration Error (ECE) ≤ 0.05.</w:t>
             </w:r>
           </w:p>
         </w:tc>
@@ -629,7 +629,7 @@
               <w:spacing w:after="80"/>
             </w:pPr>
             <w:r>
-              <w:t xml:space="preserve"/>
+              <w:t>[LEFT FOR TEAM] paste the exact success-quality metric + target stated in your A1 submission (we could not find a saved A1 form in the repo — A1 was submitted directly on Moodle per the 2026-cohort note in the spec, so this must be copied from your own A1 submission, not invented here).</w:t>
             </w:r>
           </w:p>
         </w:tc>
@@ -677,7 +677,7 @@
               <w:spacing w:after="80"/>
             </w:pPr>
             <w:r>
-              <w:t xml:space="preserve"/>
+              <w:t>Source: NCTB (National Curriculum &amp; Textbook Board, Bangladesh) public-domain secondary math textbooks, https://nctb.gov.bd/pages/static-pages/695b99afc4774958d7b70612. Size: 704 scanned pages across two books — higher_math (342 pages) and math (362 pages), ~291 MB on disk. Hardest to read: dense Bangla prose interleaved with geometry diagrams, Latin variable names, angle symbols, and numbered multi-step proofs.</w:t>
             </w:r>
           </w:p>
         </w:tc>
@@ -773,7 +773,7 @@
               <w:spacing w:after="80"/>
             </w:pPr>
             <w:r>
-              <w:t xml:space="preserve"/>
+              <w:t>Nearby pixels form strokes/characters, and a character/line looks the same under small shifts and mild rotation — this is what preprocessing (skew estimation via minAreaRect + affine correction) and line-level layout detection (horizontal ink-projection profile) exploit. Text sits in horizontal bands separated by whitespace gaps, which the row-projection line segmenter relies on directly.</w:t>
             </w:r>
           </w:p>
         </w:tc>
@@ -821,7 +821,7 @@
               <w:spacing w:after="80"/>
             </w:pPr>
             <w:r>
-              <w:t xml:space="preserve"/>
+              <w:t>Reading order carries meaning (Bangla reads left-to-right, line by line, top to bottom); Bangla conjuncts/matras span multiple glyphs but form one semantic character, so OCR must not split them mid-glyph; a page's text belongs to one coherent chapter/example/proof, which our semantic chunker exploits by splitting on textbook boundary markers (অধ্যায়, উদাহরণ, প্রমাণ, etc.) instead of cutting mid-argument.</w:t>
             </w:r>
           </w:p>
         </w:tc>
@@ -869,7 +869,7 @@
               <w:spacing w:after="80"/>
             </w:pPr>
             <w:r>
-              <w:t xml:space="preserve"/>
+              <w:t>Page position/orientation (handled by the 90°-rotation retry and skew correction), font/scan noise/ink bleed (handled by denoising + adaptive thresholding), and where a chunk boundary happens to fall (32-token overlap keeps a fact from being lost if it straddles a boundary).</w:t>
             </w:r>
           </w:p>
         </w:tc>
@@ -1031,14 +1031,7 @@
               <w:spacing w:after="80"/>
             </w:pPr>
             <w:r>
-              <w:rPr>
-                <w:i/>
-                <w:iCs/>
-                <w:color w:val="595959"/>
-                <w:sz w:val="18"/>
-                <w:szCs w:val="18"/>
-              </w:rPr>
-              <w:t xml:space="preserve">e.g. classical denoise vs VAE vs diffusion</w:t>
+              <w:t>Classical denoise (current, OpenCV) vs a trained VAE/diffusion denoiser.</w:t>
             </w:r>
           </w:p>
         </w:tc>
@@ -1051,7 +1044,7 @@
               <w:spacing w:after="80"/>
             </w:pPr>
             <w:r>
-              <w:t xml:space="preserve"/>
+              <w:t>Classical denoise only. A learned enhancer is bonus-tier (Part D of the spec) and not yet built — not because classical was judged sufficient, but because it wasn't prioritized for A2. Flagged as an A3/A4 stretch goal.</w:t>
             </w:r>
           </w:p>
         </w:tc>
@@ -1064,7 +1057,7 @@
               <w:spacing w:after="80"/>
             </w:pPr>
             <w:r>
-              <w:t xml:space="preserve"/>
+              <w:t>N/A — not attempted</w:t>
             </w:r>
           </w:p>
         </w:tc>
@@ -1092,14 +1085,7 @@
               <w:spacing w:after="80"/>
             </w:pPr>
             <w:r>
-              <w:rPr>
-                <w:i/>
-                <w:iCs/>
-                <w:color w:val="595959"/>
-                <w:sz w:val="18"/>
-                <w:szCs w:val="18"/>
-              </w:rPr>
-              <w:t xml:space="preserve">e.g. heuristic vs detection model</w:t>
+              <w:t>Heuristic horizontal ink-projection profile vs a learned detection model (ViT/CNN region proposal).</w:t>
             </w:r>
           </w:p>
         </w:tc>
@@ -1112,7 +1098,7 @@
               <w:spacing w:after="80"/>
             </w:pPr>
             <w:r>
-              <w:t xml:space="preserve"/>
+              <w:t>Classical projection-profile line segmentation with a 90°-rotation retry. Chosen because it needs no training data/labels, is deterministic, and is directly debuggable via per-page overlay images (reports/figures/layout/). A learned detector was judged unnecessary at this corpus size with no layout ground-truth available yet.</w:t>
             </w:r>
           </w:p>
         </w:tc>
@@ -1125,7 +1111,7 @@
               <w:spacing w:after="80"/>
             </w:pPr>
             <w:r>
-              <w:t xml:space="preserve"/>
+              <w:t>No — custom classical method, not a reproduction of a published model.</w:t>
             </w:r>
           </w:p>
         </w:tc>
@@ -1153,14 +1139,7 @@
               <w:spacing w:after="80"/>
             </w:pPr>
             <w:r>
-              <w:rPr>
-                <w:i/>
-                <w:iCs/>
-                <w:color w:val="595959"/>
-                <w:sz w:val="18"/>
-                <w:szCs w:val="18"/>
-              </w:rPr>
-              <w:t xml:space="preserve">e.g. Tesseract vs TrOCR vs Donut</w:t>
+              <w:t>Tesseract (LSTM engine, ben+eng) vs microsoft/trocr-base-printed (English-only TrOCR) vs a Bangla-finetuned TrOCR (nightsagittariuswolf/SWIN_TrOCR_Bangla_model).</w:t>
             </w:r>
           </w:p>
         </w:tc>
@@ -1173,7 +1152,7 @@
               <w:spacing w:after="80"/>
             </w:pPr>
             <w:r>
-              <w:t xml:space="preserve"/>
+              <w:t>Tesseract, run per detected line (psm=7). On identical pages, trocr-base-printed confidently hallucinated fluent but entirely wrong English (invoice/business text) since it is English-only; the Bangla-finetuned TrOCR produced real Bangla script but stayed weak/short; Tesseract with ben+eng language data gave the strongest legible output of the three.</w:t>
             </w:r>
           </w:p>
         </w:tc>
@@ -1186,7 +1165,7 @@
               <w:spacing w:after="80"/>
             </w:pPr>
             <w:r>
-              <w:t xml:space="preserve"/>
+              <w:t>Yes — Tesseract (pretrained LSTM OCR engine) reproduced and adapted (language pack, line segmentation, PSM tuning) on our corpus.</w:t>
             </w:r>
           </w:p>
         </w:tc>
@@ -1214,14 +1193,7 @@
               <w:spacing w:after="80"/>
             </w:pPr>
             <w:r>
-              <w:rPr>
-                <w:i/>
-                <w:iCs/>
-                <w:color w:val="595959"/>
-                <w:sz w:val="18"/>
-                <w:szCs w:val="18"/>
-              </w:rPr>
-              <w:t xml:space="preserve">e.g. fixed vs semantic; size/overlap</w:t>
+              <w:t>Fixed-size token windows vs semantic splitting on textbook structure markers.</w:t>
             </w:r>
           </w:p>
         </w:tc>
@@ -1234,7 +1206,7 @@
               <w:spacing w:after="80"/>
             </w:pPr>
             <w:r>
-              <w:t xml:space="preserve"/>
+              <w:t>Semantic mode (default): splits on Bangla textbook boundary cues (chapter/example/proof/exercise headers) before token-windowing, so a worked example or proof isn't cut mid-way; falls back to 256-token/32-overlap windows only when a unit is too long. Fixed-window mode is also implemented and selectable via index.chunking.</w:t>
             </w:r>
           </w:p>
         </w:tc>
@@ -1247,7 +1219,7 @@
               <w:spacing w:after="80"/>
             </w:pPr>
             <w:r>
-              <w:t xml:space="preserve"/>
+              <w:t>N/A — custom heuristic, not a reproduction.</w:t>
             </w:r>
           </w:p>
         </w:tc>
@@ -1275,14 +1247,7 @@
               <w:spacing w:after="80"/>
             </w:pPr>
             <w:r>
-              <w:rPr>
-                <w:i/>
-                <w:iCs/>
-                <w:color w:val="595959"/>
-                <w:sz w:val="18"/>
-                <w:szCs w:val="18"/>
-              </w:rPr>
-              <w:t xml:space="preserve">e.g. which sentence-embedding model</w:t>
+              <w:t>sentence-transformers/all-MiniLM-L6-v2 vs a deterministic hash-based fallback embedder (offline mode).</w:t>
             </w:r>
           </w:p>
         </w:tc>
@@ -1295,7 +1260,7 @@
               <w:spacing w:after="80"/>
             </w:pPr>
             <w:r>
-              <w:t xml:space="preserve"/>
+              <w:t>all-MiniLM-L6-v2 (384-dim, pretrained, not fine-tuned) — small and fast on CPU, a standard sentence-embedding baseline; a hash-embedding fallback exists in code so builds still run offline/in CI if the model can't be downloaded.</w:t>
             </w:r>
           </w:p>
         </w:tc>
@@ -1308,7 +1273,7 @@
               <w:spacing w:after="80"/>
             </w:pPr>
             <w:r>
-              <w:t xml:space="preserve"/>
+              <w:t>Yes — a published pretrained sentence-embedding model, used as-is.</w:t>
             </w:r>
           </w:p>
         </w:tc>
@@ -1336,14 +1301,7 @@
               <w:spacing w:after="80"/>
             </w:pPr>
             <w:r>
-              <w:rPr>
-                <w:i/>
-                <w:iCs/>
-                <w:color w:val="595959"/>
-                <w:sz w:val="18"/>
-                <w:szCs w:val="18"/>
-              </w:rPr>
-              <w:t xml:space="preserve">e.g. flat vs HNSW vs IVF/PQ</w:t>
+              <w:t>faiss:flat (IndexFlatIP) vs faiss:hnsw (IndexHNSWFlat).</w:t>
             </w:r>
           </w:p>
         </w:tc>
@@ -1356,7 +1314,7 @@
               <w:spacing w:after="80"/>
             </w:pPr>
             <w:r>
-              <w:t xml:space="preserve"/>
+              <w:t>faiss:flat-ip. IndexHNSWFlat segfaults reliably on our Windows + faiss-cpu 1.8 + Python 3.12 dev setup after a torch model has run; flat search is exact (no recall loss) and fast enough at our current corpus scale, so we standardized on it instead of debugging the native crash.</w:t>
             </w:r>
           </w:p>
         </w:tc>
@@ -1369,7 +1327,7 @@
               <w:spacing w:after="80"/>
             </w:pPr>
             <w:r>
-              <w:t xml:space="preserve"/>
+              <w:t>N/A — infrastructure choice, not a model.</w:t>
             </w:r>
           </w:p>
         </w:tc>
@@ -1528,7 +1486,7 @@
               <w:spacing w:after="80"/>
             </w:pPr>
             <w:r>
-              <w:t xml:space="preserve"/>
+              <w:t>None — classical CV only (OpenCV); no enhancement model.</w:t>
             </w:r>
           </w:p>
         </w:tc>
@@ -1541,7 +1499,7 @@
               <w:spacing w:after="80"/>
             </w:pPr>
             <w:r>
-              <w:t xml:space="preserve"/>
+              <w:t>denoise_strength=10, adaptive_block_size=31, adaptive_c=15, max_pages=47 (dev subset; full corpus is 704 pages)</w:t>
             </w:r>
           </w:p>
         </w:tc>
@@ -1554,7 +1512,7 @@
               <w:spacing w:after="80"/>
             </w:pPr>
             <w:r>
-              <w:t xml:space="preserve"/>
+              <w:t>N/A — classical algorithm, not a trained model</w:t>
             </w:r>
           </w:p>
         </w:tc>
@@ -1582,7 +1540,7 @@
               <w:spacing w:after="80"/>
             </w:pPr>
             <w:r>
-              <w:t xml:space="preserve"/>
+              <w:t>None — classical projection-profile line detector (OpenCV)</w:t>
             </w:r>
           </w:p>
         </w:tc>
@@ -1595,7 +1553,7 @@
               <w:spacing w:after="80"/>
             </w:pPr>
             <w:r>
-              <w:t xml:space="preserve"/>
+              <w:t>row_ink_fraction=0.01, min_line_height=12, max_line_height=140, line_gap=5, line_padding=12, min_line_width_fraction=0.03</w:t>
             </w:r>
           </w:p>
         </w:tc>
@@ -1608,7 +1566,7 @@
               <w:spacing w:after="80"/>
             </w:pPr>
             <w:r>
-              <w:t xml:space="preserve"/>
+              <w:t>N/A — classical, not a trained model</w:t>
             </w:r>
           </w:p>
         </w:tc>
@@ -1636,7 +1594,7 @@
               <w:spacing w:after="80"/>
             </w:pPr>
             <w:r>
-              <w:t xml:space="preserve"/>
+              <w:t>Tesseract OCR (ben+eng traineddata, LSTM engine, --oem 1)</w:t>
             </w:r>
           </w:p>
         </w:tc>
@@ -1649,7 +1607,7 @@
               <w:spacing w:after="80"/>
             </w:pPr>
             <w:r>
-              <w:t xml:space="preserve"/>
+              <w:t>languages=ben+eng, psm=7 (single line), crop_padding=8</w:t>
             </w:r>
           </w:p>
         </w:tc>
@@ -1662,7 +1620,7 @@
               <w:spacing w:after="80"/>
             </w:pPr>
             <w:r>
-              <w:t xml:space="preserve"/>
+              <w:t>Pretrained — off-the-shelf Tesseract ben+eng language data, not fine-tuned on our corpus</w:t>
             </w:r>
           </w:p>
         </w:tc>
@@ -1690,7 +1648,7 @@
               <w:spacing w:after="80"/>
             </w:pPr>
             <w:r>
-              <w:t xml:space="preserve"/>
+              <w:t>None — rule-based semantic splitter</w:t>
             </w:r>
           </w:p>
         </w:tc>
@@ -1703,7 +1661,7 @@
               <w:spacing w:after="80"/>
             </w:pPr>
             <w:r>
-              <w:t xml:space="preserve"/>
+              <w:t>chunk_tokens=256, overlap=32, chunking=semantic, min_chunk_tokens=24</w:t>
             </w:r>
           </w:p>
         </w:tc>
@@ -1716,7 +1674,7 @@
               <w:spacing w:after="80"/>
             </w:pPr>
             <w:r>
-              <w:t xml:space="preserve"/>
+              <w:t>N/A</w:t>
             </w:r>
           </w:p>
         </w:tc>
@@ -1744,7 +1702,7 @@
               <w:spacing w:after="80"/>
             </w:pPr>
             <w:r>
-              <w:t xml:space="preserve"/>
+              <w:t>sentence-transformers/all-MiniLM-L6-v2</w:t>
             </w:r>
           </w:p>
         </w:tc>
@@ -1757,7 +1715,7 @@
               <w:spacing w:after="80"/>
             </w:pPr>
             <w:r>
-              <w:t xml:space="preserve"/>
+              <w:t>dim=384</w:t>
             </w:r>
           </w:p>
         </w:tc>
@@ -1770,7 +1728,7 @@
               <w:spacing w:after="80"/>
             </w:pPr>
             <w:r>
-              <w:t xml:space="preserve"/>
+              <w:t>Pretrained, used as-is (not fine-tuned)</w:t>
             </w:r>
           </w:p>
         </w:tc>
@@ -1798,7 +1756,7 @@
               <w:spacing w:after="80"/>
             </w:pPr>
             <w:r>
-              <w:t xml:space="preserve"/>
+              <w:t>FAISS IndexFlatIP</w:t>
             </w:r>
           </w:p>
         </w:tc>
@@ -1811,7 +1769,7 @@
               <w:spacing w:after="80"/>
             </w:pPr>
             <w:r>
-              <w:t xml:space="preserve"/>
+              <w:t>index.type=faiss:flat-ip; vectors L2-normalized (cosine via inner product)</w:t>
             </w:r>
           </w:p>
         </w:tc>
@@ -1824,7 +1782,7 @@
               <w:spacing w:after="80"/>
             </w:pPr>
             <w:r>
-              <w:t xml:space="preserve"/>
+              <w:t>N/A — data structure, not a model</w:t>
             </w:r>
           </w:p>
         </w:tc>
@@ -1889,7 +1847,7 @@
               <w:spacing w:after="80"/>
             </w:pPr>
             <w:r>
-              <w:t xml:space="preserve"/>
+              <w:t>pages → deskew/denoise/binarize (classical CV) → [enhance: bonus-tier, not yet built] → line-level layout segmentation (projection profile) → OCR (Tesseract ben+eng per line) → semantic chunk (textbook boundary markers, 256 tok / 32 overlap) → embed (MiniLM-L6-v2, 384-dim) → FAISS flat-ip store. Changed from the default: enhancement is currently skipped; OCR backend is configurable (tesseract is the default/reproduced baseline; two TrOCR checkpoints were also implemented and compared, see Section 3).</w:t>
             </w:r>
           </w:p>
         </w:tc>
@@ -1985,7 +1943,7 @@
               <w:spacing w:after="80"/>
             </w:pPr>
             <w:r>
-              <w:t xml:space="preserve"/>
+              <w:t>[LEFT FOR LATER — needs experiments] Requires grading_kit/heldout_pages/ + labels.jsonl to be populated with real ground-truth transcriptions (currently a placeholder row) so a CER/WER can be computed against real OCR output. No labelled sample exists yet.</w:t>
             </w:r>
           </w:p>
         </w:tc>
@@ -2033,7 +1991,7 @@
               <w:spacing w:after="80"/>
             </w:pPr>
             <w:r>
-              <w:t xml:space="preserve"/>
+              <w:t>[LEFT FOR LATER — needs experiments] The last full index build hit a data-loss bug (see note below) and needs to be rebuilt before these numbers are trustworthy. Once rebuilt: report chunk count, embedding_dim=384, index_type=faiss:flat-ip (from data/processed/index/metadata.json), and pages/words indexed vs the full 704-page/2-book corpus.</w:t>
             </w:r>
           </w:p>
         </w:tc>
@@ -2081,7 +2039,7 @@
               <w:spacing w:after="80"/>
             </w:pPr>
             <w:r>
-              <w:t xml:space="preserve"/>
+              <w:t>[LEFT FOR LATER — needs experiments] Requires a working index and src/doc_agent/retrieval/retriever.py run against it with a real query from the corpus (retriever.py itself is implemented and ready).</w:t>
             </w:r>
           </w:p>
         </w:tc>
@@ -2129,7 +2087,7 @@
               <w:spacing w:after="80"/>
             </w:pPr>
             <w:r>
-              <w:t xml:space="preserve"/>
+              <w:t>[LEFT FOR LATER — needs experiments] Known issue found during A2 prep, not yet fully root-caused: a full-corpus pipeline run produced only 1 final chunk instead of dozens, even though OCR (Tesseract) verifiably produced good Bangla text for ~198/201 sampled line regions across many pages. The drop happens between OCR output and the final index — isolated `chunk.split()` unit tests pass on synthetic data, so the cause is still open; needs a clean re-run to pin down (PII redaction hook vs. something specific to the real OCR text is the leading hypothesis, unconfirmed).</w:t>
             </w:r>
           </w:p>
         </w:tc>
@@ -2230,7 +2188,7 @@
               <w:spacing w:after="80"/>
             </w:pPr>
             <w:r>
-              <w:t xml:space="preserve"/>
+              <w:t>Retrieval + rerank (cross-encoder/ms-marco-MiniLM-L6-v2, already named in configs/config.yaml's retrieve.reranker), the agent loop + tools (retrieve, rerank, read_page, enhance_page, extract, aggregate, cite, calculator, escalate_to_human), grounding with citations, guardrails/PII (PII redaction is already implemented at governance/pii.py), and the evaluation harness (grading_kit/tasks.jsonl + success_check.py). RL/RLVR only if we attempt the bonus tier.</w:t>
             </w:r>
           </w:p>
         </w:tc>
@@ -2278,7 +2236,7 @@
               <w:spacing w:after="80"/>
             </w:pPr>
             <w:r>
-              <w:t xml:space="preserve"/>
+              <w:t>We'll author grading_kit/tasks.jsonl against our two NCTB math textbooks: verifiable items (exact theorem names, numbered formula statements, example answers, page/chapter references) with a single checkable gold answer read from labelled heldout pages; judged items (why a proof step follows, summarize a section) scored by an LLM-judge rubric; and abstention cases (questions outside either book) to test the faithful baseline.</w:t>
             </w:r>
           </w:p>
         </w:tc>
@@ -2326,7 +2284,7 @@
               <w:spacing w:after="80"/>
             </w:pPr>
             <w:r>
-              <w:t xml:space="preserve"/>
+              <w:t>OCR/indexing quality on this corpus — Tesseract's ben+eng output is still noisy for dense math notation (mixed Bangla/Latin symbols, angle marks, multi-step numbered proofs), and we just found a data-loss bug between OCR and the final index (Section 5) that we haven't root-caused yet. If it doesn't get fixed, retrieval in A3 will be working over sparse/wrong text no matter how good the agent loop is. First idea: get a clean, verified full-corpus rebuild before starting A3, and add an assertion (chunk count roughly tracks page count) so this class of bug fails loudly instead of silently next time.</w:t>
             </w:r>
           </w:p>
         </w:tc>
@@ -2471,14 +2429,7 @@
               <w:spacing w:after="80"/>
             </w:pPr>
             <w:r>
-              <w:rPr>
-                <w:i/>
-                <w:iCs/>
-                <w:color w:val="595959"/>
-                <w:sz w:val="18"/>
-                <w:szCs w:val="18"/>
-              </w:rPr>
-              <w:t xml:space="preserve">what these stages must achieve + success metric</w:t>
+              <w:t>Turn 704 scanned pages of two Bangla NCTB math textbooks into a clean, retrievable knowledge base; success = the corpus is OCR'd and indexed well enough that a real query returns the right page (Section 5), building toward the course-wide groundedness ≥0.90 / citation ≥0.90 baseline and our ECE ≤0.05 primary NFR (graded in A3).</w:t>
             </w:r>
           </w:p>
         </w:tc>
@@ -2491,14 +2442,7 @@
               <w:spacing w:after="80"/>
             </w:pPr>
             <w:r>
-              <w:rPr>
-                <w:i/>
-                <w:iCs/>
-                <w:color w:val="595959"/>
-                <w:sz w:val="18"/>
-                <w:szCs w:val="18"/>
-              </w:rPr>
-              <w:t xml:space="preserve">why this · its cost · what would change our mind</w:t>
+              <w:t>Fits our corpus because both books share a similar scanned layout (single column, printed, occasional geometry figures); costs us OCR quality (Bangla math notation is genuinely hard for any current OCR); would change if the primary NFR were latency/throughput instead of calibration.</w:t>
             </w:r>
           </w:p>
         </w:tc>
@@ -2526,14 +2470,7 @@
               <w:spacing w:after="80"/>
             </w:pPr>
             <w:r>
-              <w:rPr>
-                <w:i/>
-                <w:iCs/>
-                <w:color w:val="595959"/>
-                <w:sz w:val="18"/>
-                <w:szCs w:val="18"/>
-              </w:rPr>
-              <w:t xml:space="preserve">inputs, formats, splits, any labels used</w:t>
+              <w:t>Input: 704 raw page PNGs across 2 documents (higher_math 342p, math 362p), no labels used yet (all stages are classical or pretrained-only); split policy is per-document so no page from a held-out book leaks into training/eval.</w:t>
             </w:r>
           </w:p>
         </w:tc>
@@ -2546,14 +2483,7 @@
               <w:spacing w:after="80"/>
             </w:pPr>
             <w:r>
-              <w:rPr>
-                <w:i/>
-                <w:iCs/>
-                <w:color w:val="595959"/>
-                <w:sz w:val="18"/>
-                <w:szCs w:val="18"/>
-              </w:rPr>
-              <w:t xml:space="preserve">why this · its cost · what would change our mind</w:t>
+              <w:t>Splitting by document (not page) avoids leakage per C3; costs us statistical power since we only have 2 documents to split across; would change if we added a 3rd source book, letting us hold one out entirely.</w:t>
             </w:r>
           </w:p>
         </w:tc>
@@ -2581,14 +2511,7 @@
               <w:spacing w:after="80"/>
             </w:pPr>
             <w:r>
-              <w:rPr>
-                <w:i/>
-                <w:iCs/>
-                <w:color w:val="595959"/>
-                <w:sz w:val="18"/>
-                <w:szCs w:val="18"/>
-              </w:rPr>
-              <w:t xml:space="preserve">checkpoints chosen per stage</w:t>
+              <w:t>No trained models at Stages 1-2 (classical CV); Stage 3 = Tesseract (pretrained, off-the-shelf ben+eng); Stage 4 = sentence-transformers/all-MiniLM-L6-v2 (pretrained, 384-dim) + FAISS IndexFlatIP.</w:t>
             </w:r>
           </w:p>
         </w:tc>
@@ -2601,14 +2524,7 @@
               <w:spacing w:after="80"/>
             </w:pPr>
             <w:r>
-              <w:rPr>
-                <w:i/>
-                <w:iCs/>
-                <w:color w:val="595959"/>
-                <w:sz w:val="18"/>
-                <w:szCs w:val="18"/>
-              </w:rPr>
-              <w:t xml:space="preserve">why this · its cost · what would change our mind</w:t>
+              <w:t>Chosen for zero-training-data cost and CPU-only feasibility (no GPU on the dev machine); costs some OCR/embedding quality versus a corpus-finetuned model; would change if we fine-tune Tesseract or swap to a Bangla-specific sentence embedder once we have labelled data.</w:t>
             </w:r>
           </w:p>
         </w:tc>
@@ -2636,14 +2552,7 @@
               <w:spacing w:after="80"/>
             </w:pPr>
             <w:r>
-              <w:rPr>
-                <w:i/>
-                <w:iCs/>
-                <w:color w:val="595959"/>
-                <w:sz w:val="18"/>
-                <w:szCs w:val="18"/>
-              </w:rPr>
-              <w:t xml:space="preserve">fine-tuning / inference technique, key hyperparameters</w:t>
+              <w:t>Inference-only throughout (no fine-tuning yet): deskew+denoise+adaptive-threshold, line-projection segmentation with 90°-rotation retry, Tesseract LSTM engine at psm=7, semantic-then-token-window chunking (256/32), cosine (via inner product) similarity search.</w:t>
             </w:r>
           </w:p>
         </w:tc>
@@ -2656,14 +2565,7 @@
               <w:spacing w:after="80"/>
             </w:pPr>
             <w:r>
-              <w:rPr>
-                <w:i/>
-                <w:iCs/>
-                <w:color w:val="595959"/>
-                <w:sz w:val="18"/>
-                <w:szCs w:val="18"/>
-              </w:rPr>
-              <w:t xml:space="preserve">why this · its cost · what would change our mind</w:t>
+              <w:t>Keeps the pipeline reproducible and fast to iterate on before committing to a fine-tuning run; costs precision on hard pages (multi-column, rotated, dense proofs); would change once we have enough labelled heldout pages to justify fine-tuning.</w:t>
             </w:r>
           </w:p>
         </w:tc>
@@ -2691,14 +2593,7 @@
               <w:spacing w:after="80"/>
             </w:pPr>
             <w:r>
-              <w:rPr>
-                <w:i/>
-                <w:iCs/>
-                <w:color w:val="595959"/>
-                <w:sz w:val="18"/>
-                <w:szCs w:val="18"/>
-              </w:rPr>
-              <w:t xml:space="preserve">how the stages connect (the data contracts)</w:t>
+              <w:t>Stages connect through fixed Pydantic contracts (Page -&gt; Region -&gt; Chunk) in contracts.py; pipeline.py enforces the stage order (ingest -&gt; preprocess -&gt; layout -&gt; ocr -&gt; chunk -&gt; embed -&gt; store) and is not touched by us.</w:t>
             </w:r>
           </w:p>
         </w:tc>
@@ -2711,14 +2606,7 @@
               <w:spacing w:after="80"/>
             </w:pPr>
             <w:r>
-              <w:rPr>
-                <w:i/>
-                <w:iCs/>
-                <w:color w:val="595959"/>
-                <w:sz w:val="18"/>
-                <w:szCs w:val="18"/>
-              </w:rPr>
-              <w:t xml:space="preserve">why this · its cost · what would change our mind</w:t>
+              <w:t>Locked contracts mean any stage can be swapped independently (e.g. OCR backend is a one-line config change) without breaking downstream stages; the cost is the pipeline can't skip/reorder stages even when a shortcut would help.</w:t>
             </w:r>
           </w:p>
         </w:tc>
@@ -2746,14 +2634,7 @@
               <w:spacing w:after="80"/>
             </w:pPr>
             <w:r>
-              <w:rPr>
-                <w:i/>
-                <w:iCs/>
-                <w:color w:val="595959"/>
-                <w:sz w:val="18"/>
-                <w:szCs w:val="18"/>
-              </w:rPr>
-              <w:t xml:space="preserve">tests, config, experiment logging</w:t>
+              <w:t>Config-driven experimentation (configs/config.yaml) rather than code edits per run; layout has a debug-overlay mode (reports/figures/layout/) to visually inspect line-detection failures per page; git commit history documents the OCR backend comparisons as they happened.</w:t>
             </w:r>
           </w:p>
         </w:tc>
@@ -2766,14 +2647,7 @@
               <w:spacing w:after="80"/>
             </w:pPr>
             <w:r>
-              <w:rPr>
-                <w:i/>
-                <w:iCs/>
-                <w:color w:val="595959"/>
-                <w:sz w:val="18"/>
-                <w:szCs w:val="18"/>
-              </w:rPr>
-              <w:t xml:space="preserve">why this · its cost · what would change our mind</w:t>
+              <w:t>Cheap to compare configurations without redeploying code; costs us formal experiment tracking (no W&amp;B yet) — currently just log inspection and commit messages; would change once Stage 7/8 (RL, LoRA) need proper run tracking.</w:t>
             </w:r>
           </w:p>
         </w:tc>
@@ -2801,14 +2675,7 @@
               <w:spacing w:after="80"/>
             </w:pPr>
             <w:r>
-              <w:rPr>
-                <w:i/>
-                <w:iCs/>
-                <w:color w:val="595959"/>
-                <w:sz w:val="18"/>
-                <w:szCs w:val="18"/>
-              </w:rPr>
-              <w:t xml:space="preserve">how indexing runs (batch, device, memory)</w:t>
+              <w:t>Runs as a local batch job (scripts/build_index.sh -&gt; scripts/run_index.py), CPU-only, single process, no serving yet.</w:t>
             </w:r>
           </w:p>
         </w:tc>
@@ -2821,14 +2688,7 @@
               <w:spacing w:after="80"/>
             </w:pPr>
             <w:r>
-              <w:rPr>
-                <w:i/>
-                <w:iCs/>
-                <w:color w:val="595959"/>
-                <w:sz w:val="18"/>
-                <w:szCs w:val="18"/>
-              </w:rPr>
-              <w:t xml:space="preserve">why this · its cost · what would change our mind</w:t>
+              <w:t>Matches current scale and avoids GPU/infra cost during the build-KB milestone; would change once Stage 8 (serving) needs incremental/scheduled indexing rather than a one-shot rebuild.</w:t>
             </w:r>
           </w:p>
         </w:tc>
@@ -2856,14 +2716,7 @@
               <w:spacing w:after="80"/>
             </w:pPr>
             <w:r>
-              <w:rPr>
-                <w:i/>
-                <w:iCs/>
-                <w:color w:val="595959"/>
-                <w:sz w:val="18"/>
-                <w:szCs w:val="18"/>
-              </w:rPr>
-              <w:t xml:space="preserve">corpus versioning, what you'd monitor</w:t>
+              <w:t>Corpus is not committed to git (291MB); scripts/get_data.sh re-fetches and validates against an expected image count (704) so the corpus is versioned by source, not by git diff; nothing is monitored in production yet (no serving).</w:t>
             </w:r>
           </w:p>
         </w:tc>
@@ -2876,14 +2729,7 @@
               <w:spacing w:after="80"/>
             </w:pPr>
             <w:r>
-              <w:rPr>
-                <w:i/>
-                <w:iCs/>
-                <w:color w:val="595959"/>
-                <w:sz w:val="18"/>
-                <w:szCs w:val="18"/>
-              </w:rPr>
-              <w:t xml:space="preserve">why this · its cost · what would change our mind</w:t>
+              <w:t>Keeps the repo small and reproducible from a pinned source; costs us if the source disappears/changes without our noticing (no checksum pinning yet); would change once we deploy, adding drift/monitoring per mlops/monitor.py.</w:t>
             </w:r>
           </w:p>
         </w:tc>

</xml_diff>